<commit_message>
fixes to icwa form
</commit_message>
<xml_diff>
--- a/templates/noticetotribes/notice_to_tribe.docx
+++ b/templates/noticetotribes/notice_to_tribe.docx
@@ -487,7 +487,7 @@
         </w:rPr>
         <w:t>1.</w:t>
         <w:tab/>
-        <w:t>The Petition for Adoption will be heard on the __________ day of ____________, 20____, at _____________ __.m. before the Honorable Judge ________________ in the District Courthouse at {{ county }} County, State of Oklahoma.</w:t>
+        <w:t>The Petition for Adoption will be heard on the {{ petition_hearing_date }}, at _____________ __.m. before the Honorable Judge {{ judge_name }} in the District Courthouse at {{ courthouse_city }}, {{ county }} County, State of Oklahoma.</w:t>
       </w:r>
     </w:p>
     <w:p>
@@ -541,7 +541,7 @@
         </w:rPr>
         <w:t>3.</w:t>
         <w:tab/>
-        <w:t>That the names of the birth parents of the minor child(ren) are __________________, and _______________________.</w:t>
+        <w:t>That the names of the birth parents of the minor child(ren) are {% if bio_mother_name %}{{ bio_mother_name }}{% elif other_parent_name %}{{ petitioner1_name }}{% else %}__________________{% endif %}, and {% if bio_father_name %}{{ bio_father_name }}{% elif other_parent_name %}{{ other_parent_name }}{% else %}_______________________{% endif %}.</w:t>
       </w:r>
     </w:p>
     <w:p>
@@ -833,6 +833,7 @@
     <w:p>
       <w:pPr>
         <w:spacing w:lineRule="exact" w:line="240"/>
+        <w:ind w:left="4320"/>
       </w:pPr>
       <w:r>
         <w:rPr>
@@ -845,6 +846,7 @@
     <w:p>
       <w:pPr>
         <w:spacing w:lineRule="exact" w:line="240"/>
+        <w:ind w:left="4320"/>
       </w:pPr>
       <w:r>
         <w:rPr>
@@ -857,6 +859,7 @@
     <w:p>
       <w:pPr>
         <w:spacing w:lineRule="exact" w:line="240"/>
+        <w:ind w:left="4320"/>
       </w:pPr>
       <w:r>
         <w:rPr>
@@ -869,6 +872,7 @@
     <w:p>
       <w:pPr>
         <w:spacing w:lineRule="exact" w:line="240"/>
+        <w:ind w:left="4320"/>
       </w:pPr>
       <w:r>
         <w:rPr>
@@ -881,6 +885,7 @@
     <w:p>
       <w:pPr>
         <w:spacing w:lineRule="exact" w:line="240"/>
+        <w:ind w:left="4320"/>
       </w:pPr>
       <w:r>
         <w:rPr>
@@ -893,6 +898,7 @@
     <w:p>
       <w:pPr>
         <w:spacing w:lineRule="exact" w:line="240"/>
+        <w:ind w:left="4320"/>
       </w:pPr>
       <w:r>
         <w:rPr>
@@ -905,6 +911,7 @@
     <w:p>
       <w:pPr>
         <w:spacing w:lineRule="exact" w:line="240"/>
+        <w:ind w:left="4320"/>
       </w:pPr>
       <w:r>
         <w:rPr>
@@ -1402,7 +1409,7 @@
           <w:rFonts w:ascii="Times New Roman" w:hAnsi="Times New Roman"/>
           <w:sz w:val="24"/>
         </w:rPr>
-        <w:t>at the address shown by Registered Mail, restricted delivery, return receipt requested, on the ____ day of __________, 20____, and receipt thereof on the date shown:</w:t>
+        <w:t>at the address shown by Registered Mail, restricted delivery, return receipt requested, on the {{ notice_mailing_date }}, and receipt thereof on the date shown:</w:t>
       </w:r>
     </w:p>
     <w:p>
@@ -1638,6 +1645,7 @@
     <w:p>
       <w:pPr>
         <w:spacing w:lineRule="exact" w:line="240"/>
+        <w:ind w:left="4320"/>
       </w:pPr>
       <w:r>
         <w:rPr>
@@ -1650,6 +1658,7 @@
     <w:p>
       <w:pPr>
         <w:spacing w:lineRule="exact" w:line="240"/>
+        <w:ind w:left="4320"/>
       </w:pPr>
       <w:r>
         <w:rPr>
@@ -1662,6 +1671,7 @@
     <w:p>
       <w:pPr>
         <w:spacing w:lineRule="exact" w:line="240"/>
+        <w:ind w:left="4320"/>
       </w:pPr>
       <w:r>
         <w:rPr>
@@ -1674,6 +1684,7 @@
     <w:p>
       <w:pPr>
         <w:spacing w:lineRule="exact" w:line="240"/>
+        <w:ind w:left="4320"/>
       </w:pPr>
       <w:r>
         <w:rPr>
@@ -1686,6 +1697,7 @@
     <w:p>
       <w:pPr>
         <w:spacing w:lineRule="exact" w:line="240"/>
+        <w:ind w:left="4320"/>
       </w:pPr>
       <w:r>
         <w:rPr>
@@ -1698,6 +1710,7 @@
     <w:p>
       <w:pPr>
         <w:spacing w:lineRule="exact" w:line="240"/>
+        <w:ind w:left="4320"/>
       </w:pPr>
       <w:r>
         <w:rPr>
@@ -1710,6 +1723,7 @@
     <w:p>
       <w:pPr>
         <w:spacing w:lineRule="exact" w:line="240"/>
+        <w:ind w:left="4320"/>
       </w:pPr>
       <w:r>
         <w:rPr>

</xml_diff>